<commit_message>
Improve scholarship web application features and UI
</commit_message>
<xml_diff>
--- a/docs/Scholarship_Provider_Online_Questionnaire.docx
+++ b/docs/Scholarship_Provider_Online_Questionnaire.docx
@@ -38,7 +38,7 @@
     </w:p>
     <w:p>
       <w:r>
-        <w:t>This questionnaire is intended for personnel who design, administer, review, approve, or support scholarship and educational-assistance programs. It gathers information about actual provider workflows and evaluates whether the proposed platform reflects provider needs. It may be completed online without a live interview.</w:t>
+        <w:t>This questionnaire is intended for personnel who design, administer, review, approve, or support scholarship and educational-assistance programs. It gathers information about actual provider workflows (the steps staff follow from announcing a program through selecting and supporting recipients) and evaluates whether the proposed platform reflects provider needs. It may be completed online without a live interview.</w:t>
       </w:r>
     </w:p>
     <w:p>
@@ -48,7 +48,7 @@
     </w:p>
     <w:p>
       <w:r>
-        <w:t>Google Forms setup: Create one form section for every heading below. Apply the stated question type. Use response validation where noted and enable the indicated skip logic for the consent question.</w:t>
+        <w:t>Google Forms setup: Create one form section for every heading below. Apply the stated question type. Use response validation (rules that check whether an answer is entered correctly) where noted, and enable skip logic (automatically ending or moving the form based on an answer) for the consent question. Place the Plain Language Guide in the form description or repeat the relevant meaning in a question description.</w:t>
       </w:r>
     </w:p>
     <w:p>
@@ -57,37 +57,157 @@
         <w:keepNext/>
       </w:pPr>
       <w:r>
-        <w:t>Researcher Information to Complete Before Distribution</w:t>
-      </w:r>
-    </w:p>
-    <w:p>
-      <w:r>
-        <w:t>Researchers: ________________________________________________</w:t>
-      </w:r>
-    </w:p>
-    <w:p>
-      <w:r>
-        <w:t>School and program: ________________________________________________</w:t>
-      </w:r>
-    </w:p>
-    <w:p>
-      <w:r>
-        <w:t>Research adviser: ________________________________________________</w:t>
-      </w:r>
-    </w:p>
-    <w:p>
-      <w:r>
-        <w:t>Research contact email: ________________________________________________</w:t>
-      </w:r>
-    </w:p>
-    <w:p>
-      <w:r>
-        <w:t>Target closing date: ________________________________________________</w:t>
-      </w:r>
-    </w:p>
-    <w:p>
-      <w:r>
-        <w:t>Approved data-retention period: ________________________________________________</w:t>
+        <w:t>Plain Language Guide</w:t>
+      </w:r>
+    </w:p>
+    <w:p>
+      <w:pPr/>
+      <w:r>
+        <w:t>The following meanings are used throughout this questionnaire so respondents can interpret the questions consistently.</w:t>
+      </w:r>
+    </w:p>
+    <w:p>
+      <w:pPr>
+        <w:spacing w:after="60"/>
+      </w:pPr>
+      <w:r>
+        <w:rPr>
+          <w:b/>
+        </w:rPr>
+        <w:t xml:space="preserve">Eligibility criteria. </w:t>
+      </w:r>
+      <w:r/>
+      <w:r/>
+      <w:r>
+        <w:t>The qualifications an applicant must meet, such as grade level, academic average, income, or location.</w:t>
+      </w:r>
+    </w:p>
+    <w:p>
+      <w:pPr>
+        <w:spacing w:after="60"/>
+      </w:pPr>
+      <w:r>
+        <w:rPr>
+          <w:b/>
+        </w:rPr>
+        <w:t xml:space="preserve">Prescreening. </w:t>
+      </w:r>
+      <w:r/>
+      <w:r/>
+      <w:r>
+        <w:t>An early check of published eligibility and submitted files; it is not the provider's final approval.</w:t>
+      </w:r>
+    </w:p>
+    <w:p>
+      <w:pPr>
+        <w:spacing w:after="60"/>
+      </w:pPr>
+      <w:r>
+        <w:rPr>
+          <w:b/>
+        </w:rPr>
+        <w:t xml:space="preserve">Formal application. </w:t>
+      </w:r>
+      <w:r/>
+      <w:r/>
+      <w:r>
+        <w:t>The provider's official application process after an applicant passes the initial check.</w:t>
+      </w:r>
+    </w:p>
+    <w:p>
+      <w:pPr>
+        <w:spacing w:after="60"/>
+      </w:pPr>
+      <w:r>
+        <w:rPr>
+          <w:b/>
+        </w:rPr>
+        <w:t xml:space="preserve">Matching result. </w:t>
+      </w:r>
+      <w:r/>
+      <w:r/>
+      <w:r>
+        <w:t>A comparison between applicant information and published program rules; it guides review but does not guarantee acceptance.</w:t>
+      </w:r>
+    </w:p>
+    <w:p>
+      <w:pPr>
+        <w:spacing w:after="60"/>
+      </w:pPr>
+      <w:r>
+        <w:rPr>
+          <w:b/>
+        </w:rPr>
+        <w:t xml:space="preserve">Weighted rubric. </w:t>
+      </w:r>
+      <w:r/>
+      <w:r/>
+      <w:r>
+        <w:t>A scoring guide in which some review criteria are worth more points than others.</w:t>
+      </w:r>
+    </w:p>
+    <w:p>
+      <w:pPr>
+        <w:spacing w:after="60"/>
+      </w:pPr>
+      <w:r>
+        <w:rPr>
+          <w:b/>
+        </w:rPr>
+        <w:t xml:space="preserve">Pilot implementation. </w:t>
+      </w:r>
+      <w:r/>
+      <w:r/>
+      <w:r>
+        <w:t>A small, supervised trial used to test the platform before wider use.</w:t>
+      </w:r>
+    </w:p>
+    <w:p>
+      <w:pPr>
+        <w:spacing w:after="60"/>
+      </w:pPr>
+      <w:r>
+        <w:rPr>
+          <w:b/>
+        </w:rPr>
+        <w:t xml:space="preserve">Role-based permissions. </w:t>
+      </w:r>
+      <w:r/>
+      <w:r/>
+      <w:r>
+        <w:t>Access controls that allow staff to use only the information and functions needed for their assigned duties.</w:t>
+      </w:r>
+    </w:p>
+    <w:p>
+      <w:pPr>
+        <w:spacing w:after="60"/>
+      </w:pPr>
+      <w:r>
+        <w:rPr>
+          <w:b/>
+        </w:rPr>
+        <w:t xml:space="preserve">Audit history. </w:t>
+      </w:r>
+      <w:r/>
+      <w:r/>
+      <w:r>
+        <w:t>A record of important actions, changes, and decisions that authorized reviewers can check later.</w:t>
+      </w:r>
+    </w:p>
+    <w:p>
+      <w:pPr>
+        <w:spacing w:after="60"/>
+      </w:pPr>
+      <w:r>
+        <w:rPr>
+          <w:b/>
+        </w:rPr>
+        <w:t xml:space="preserve">Data-retention period. </w:t>
+      </w:r>
+      <w:r/>
+      <w:r/>
+      <w:r>
+        <w:t>The approved length of time that research responses or platform records are kept before secure deletion.</w:t>
       </w:r>
     </w:p>
     <w:p>
@@ -96,12 +216,51 @@
         <w:keepNext/>
       </w:pPr>
       <w:r>
+        <w:t>Researcher Information to Complete Before Distribution</w:t>
+      </w:r>
+    </w:p>
+    <w:p>
+      <w:r>
+        <w:t>Researchers: ________________________________________________</w:t>
+      </w:r>
+    </w:p>
+    <w:p>
+      <w:r>
+        <w:t>School and program: ________________________________________________</w:t>
+      </w:r>
+    </w:p>
+    <w:p>
+      <w:r>
+        <w:t>Research adviser: ________________________________________________</w:t>
+      </w:r>
+    </w:p>
+    <w:p>
+      <w:r>
+        <w:t>Research contact email: ________________________________________________</w:t>
+      </w:r>
+    </w:p>
+    <w:p>
+      <w:r>
+        <w:t>Target closing date: ________________________________________________</w:t>
+      </w:r>
+    </w:p>
+    <w:p>
+      <w:r>
+        <w:t>Approved data-retention period: ________________________________________________</w:t>
+      </w:r>
+    </w:p>
+    <w:p>
+      <w:pPr>
+        <w:pStyle w:val="Heading1"/>
+        <w:keepNext/>
+      </w:pPr>
+      <w:r>
         <w:t>Consent and Respondent Qualification</w:t>
       </w:r>
     </w:p>
     <w:p>
       <w:r>
-        <w:t>Participation is voluntary. A respondent may stop at any time or leave an optional question unanswered. Responses will be analyzed for academic research and system evaluation. Reported findings should be aggregated or anonymized unless the respondent separately permits identification. The research team must store responses securely and follow the protocol approved by its school.</w:t>
+        <w:t>Participation is voluntary. A respondent may stop at any time or leave an optional question unanswered. Responses will be analyzed for academic research and system evaluation. Reported findings should be aggregated (combined into group results) or anonymized (names and identifying details removed) unless the respondent separately permits identification. The research team must store responses securely and follow the protocol approved by its school.</w:t>
       </w:r>
     </w:p>
     <w:p>
@@ -237,7 +396,7 @@
         <w:rPr>
           <w:b/>
         </w:rPr>
-        <w:t>3. May anonymized statements from your response be quoted in the capstone report?</w:t>
+        <w:t>3. May anonymized statements (quotations with your name and identifying details removed) from your response be quoted in the capstone report?</w:t>
       </w:r>
     </w:p>
     <w:p>
@@ -356,7 +515,7 @@
         <w:ind w:left="504"/>
       </w:pPr>
       <w:r>
-        <w:t>[ ] Company or corporate social responsibility program</w:t>
+        <w:t>[ ] Company or corporate social responsibility program (a company initiative that supports communities or social causes)</w:t>
       </w:r>
     </w:p>
     <w:p>
@@ -460,7 +619,7 @@
         <w:ind w:left="504"/>
       </w:pPr>
       <w:r>
-        <w:t>[ ] Setting eligibility criteria</w:t>
+        <w:t>[ ] Setting eligibility criteria (the qualifications an applicant must meet)</w:t>
       </w:r>
     </w:p>
     <w:p>
@@ -853,7 +1012,7 @@
         <w:rPr>
           <w:b/>
         </w:rPr>
-        <w:t>10. Approximately how many applications does your organization receive in a typical scholarship cycle?</w:t>
+        <w:t>10. Approximately how many applications does your organization receive in a typical scholarship cycle (one complete application period, from opening through selection)?</w:t>
       </w:r>
     </w:p>
     <w:p>
@@ -1149,6 +1308,18 @@
     </w:p>
     <w:p>
       <w:pPr>
+        <w:spacing w:after="40"/>
+      </w:pPr>
+      <w:r>
+        <w:rPr>
+          <w:i/>
+          <w:color w:val="555555"/>
+        </w:rPr>
+        <w:t>Description for respondents: Select all stages your organization normally uses, from announcing the opportunity through monitoring scholars.</w:t>
+      </w:r>
+    </w:p>
+    <w:p>
+      <w:pPr>
         <w:spacing w:after="60"/>
         <w:ind w:left="317"/>
         <w:keepNext/>
@@ -1193,7 +1364,7 @@
         <w:ind w:left="504"/>
       </w:pPr>
       <w:r>
-        <w:t>[ ] Document prescreening</w:t>
+        <w:t>[ ] Document prescreening (an initial completeness check, not final authentication)</w:t>
       </w:r>
     </w:p>
     <w:p>
@@ -1202,7 +1373,7 @@
         <w:ind w:left="504"/>
       </w:pPr>
       <w:r>
-        <w:t>[ ] Formal application</w:t>
+        <w:t>[ ] Formal application (the provider's official application after an initial portal check)</w:t>
       </w:r>
     </w:p>
     <w:p>
@@ -1238,7 +1409,7 @@
         <w:ind w:left="504"/>
       </w:pPr>
       <w:r>
-        <w:t>[ ] Background or original-document verification</w:t>
+        <w:t>[ ] Background or original-document verification (checking authenticity against original or official records)</w:t>
       </w:r>
     </w:p>
     <w:p>
@@ -1247,7 +1418,7 @@
         <w:ind w:left="504"/>
       </w:pPr>
       <w:r>
-        <w:t>[ ] Committee review</w:t>
+        <w:t>[ ] Committee review (a decision discussed by an authorized group rather than one reviewer)</w:t>
       </w:r>
     </w:p>
     <w:p>
@@ -1256,7 +1427,7 @@
         <w:ind w:left="504"/>
       </w:pPr>
       <w:r>
-        <w:t>[ ] Waitlisting or alternate selection</w:t>
+        <w:t>[ ] Waitlisting or alternate selection (keeping qualified backup candidates if a slot becomes available)</w:t>
       </w:r>
     </w:p>
     <w:p>
@@ -1274,7 +1445,7 @@
         <w:ind w:left="504"/>
       </w:pPr>
       <w:r>
-        <w:t>[ ] Award orientation or contract</w:t>
+        <w:t>[ ] Award orientation or contract (briefing selected applicants on benefits, duties, and conditions)</w:t>
       </w:r>
     </w:p>
     <w:p>
@@ -1304,7 +1475,19 @@
         <w:rPr>
           <w:b/>
         </w:rPr>
-        <w:t>14. Does your organization distinguish initial prescreening from the formal scholarship application?</w:t>
+        <w:t>14. Does your organization distinguish initial prescreening (an early eligibility and file check) from the formal scholarship application (the provider's official application process)?</w:t>
+      </w:r>
+    </w:p>
+    <w:p>
+      <w:pPr>
+        <w:spacing w:after="40"/>
+      </w:pPr>
+      <w:r>
+        <w:rPr>
+          <w:i/>
+          <w:color w:val="555555"/>
+        </w:rPr>
+        <w:t>Description for respondents: Prescreening is the early eligibility and file check. The formal application is the provider's official application after that check.</w:t>
       </w:r>
     </w:p>
     <w:p>
@@ -1914,7 +2097,19 @@
         <w:rPr>
           <w:b/>
         </w:rPr>
-        <w:t>20. How should criteria marked Any or Open to all affect a matching result?</w:t>
+        <w:t>20. How should criteria marked Any or Open to all affect a matching result (the platform's comparison of applicant information with published program rules)?</w:t>
+      </w:r>
+    </w:p>
+    <w:p>
+      <w:pPr>
+        <w:spacing w:after="40"/>
+      </w:pPr>
+      <w:r>
+        <w:rPr>
+          <w:i/>
+          <w:color w:val="555555"/>
+        </w:rPr>
+        <w:t>Description for respondents: Any or Open to all means the provider has not limited that criterion to a specific group.</w:t>
       </w:r>
     </w:p>
     <w:p>
@@ -1989,6 +2184,18 @@
     </w:p>
     <w:p>
       <w:pPr>
+        <w:spacing w:after="40"/>
+      </w:pPr>
+      <w:r>
+        <w:rPr>
+          <w:i/>
+          <w:color w:val="555555"/>
+        </w:rPr>
+        <w:t>Description for respondents: Consider the grading scale your organization uses and how results are compared when scales differ.</w:t>
+      </w:r>
+    </w:p>
+    <w:p>
+      <w:pPr>
         <w:spacing w:after="60"/>
         <w:ind w:left="317"/>
         <w:keepNext/>
@@ -2042,7 +2249,7 @@
         <w:ind w:left="504"/>
       </w:pPr>
       <w:r>
-        <w:t>[ ] Provider equivalency table</w:t>
+        <w:t>[ ] Provider equivalency table (the organization's rules for comparing different grading systems)</w:t>
       </w:r>
     </w:p>
     <w:p>
@@ -2166,7 +2373,7 @@
         <w:ind w:left="504"/>
       </w:pPr>
       <w:r>
-        <w:t>[ ] Provider-specific declaration</w:t>
+        <w:t>[ ] Provider-specific declaration (a signed statement or form required by the organization)</w:t>
       </w:r>
     </w:p>
     <w:p>
@@ -2196,7 +2403,19 @@
         <w:rPr>
           <w:b/>
         </w:rPr>
-        <w:t>23. Should sensitive documents be delayed until they are necessary for formal verification?</w:t>
+        <w:t>23. Should sensitive documents (records containing personal details that require stronger privacy protection) be delayed until they are necessary for formal verification?</w:t>
+      </w:r>
+    </w:p>
+    <w:p>
+      <w:pPr>
+        <w:spacing w:after="40"/>
+      </w:pPr>
+      <w:r>
+        <w:rPr>
+          <w:i/>
+          <w:color w:val="555555"/>
+        </w:rPr>
+        <w:t>Description for respondents: This asks whether documents with more sensitive personal details should be requested only when they are needed.</w:t>
       </w:r>
     </w:p>
     <w:p>
@@ -2271,6 +2490,18 @@
     </w:p>
     <w:p>
       <w:pPr>
+        <w:spacing w:after="40"/>
+      </w:pPr>
+      <w:r>
+        <w:rPr>
+          <w:i/>
+          <w:color w:val="555555"/>
+        </w:rPr>
+        <w:t>Description for respondents: Original documents may be shown in person or checked against official records to confirm authenticity.</w:t>
+      </w:r>
+    </w:p>
+    <w:p>
+      <w:pPr>
         <w:spacing w:after="60"/>
         <w:ind w:left="317"/>
         <w:keepNext/>
@@ -2315,7 +2546,7 @@
         <w:ind w:left="504"/>
       </w:pPr>
       <w:r>
-        <w:t>[ ] After conditional selection</w:t>
+        <w:t>[ ] After conditional selection (chosen subject to final checks or requirements)</w:t>
       </w:r>
     </w:p>
     <w:p>
@@ -2438,6 +2669,18 @@
     </w:p>
     <w:p>
       <w:pPr>
+        <w:spacing w:after="40"/>
+      </w:pPr>
+      <w:r>
+        <w:rPr>
+          <w:i/>
+          <w:color w:val="555555"/>
+        </w:rPr>
+        <w:t>Description for respondents: A review method is the checklist, score, ranking, or decision process used by reviewers.</w:t>
+      </w:r>
+    </w:p>
+    <w:p>
+      <w:pPr>
         <w:spacing w:after="60"/>
         <w:ind w:left="317"/>
         <w:keepNext/>
@@ -2473,7 +2716,7 @@
         <w:ind w:left="504"/>
       </w:pPr>
       <w:r>
-        <w:t>[ ] Weighted rubric</w:t>
+        <w:t>[ ] Weighted rubric (a scoring guide in which some criteria are worth more points than others)</w:t>
       </w:r>
     </w:p>
     <w:p>
@@ -2567,6 +2810,18 @@
     </w:p>
     <w:p>
       <w:pPr>
+        <w:spacing w:after="40"/>
+      </w:pPr>
+      <w:r>
+        <w:rPr>
+          <w:i/>
+          <w:color w:val="555555"/>
+        </w:rPr>
+        <w:t>Description for respondents: Rate each statement based on how well it reflects what your organization needs.</w:t>
+      </w:r>
+    </w:p>
+    <w:p>
+      <w:pPr>
         <w:spacing w:after="60"/>
         <w:ind w:left="317"/>
         <w:keepNext/>
@@ -2603,7 +2858,7 @@
         <w:ind w:left="504"/>
       </w:pPr>
       <w:r>
-        <w:t>[ ] Strict eligibility requirements should be separated from preferences or ranking factors.</w:t>
+        <w:t>[ ] Strict eligibility requirements (qualifications that must be met) should be separated from preferences or ranking factors (details used to compare otherwise eligible applicants).</w:t>
       </w:r>
     </w:p>
     <w:p>
@@ -2657,7 +2912,7 @@
         <w:ind w:left="504"/>
       </w:pPr>
       <w:r>
-        <w:t>[ ] The platform should record important decisions and corrections for accountability.</w:t>
+        <w:t>[ ] The platform should record important decisions and corrections for accountability (so authorized reviewers can later check what happened and who acted).</w:t>
       </w:r>
     </w:p>
     <w:p>
@@ -2744,6 +2999,18 @@
     </w:p>
     <w:p>
       <w:pPr>
+        <w:spacing w:after="40"/>
+      </w:pPr>
+      <w:r>
+        <w:rPr>
+          <w:i/>
+          <w:color w:val="555555"/>
+        </w:rPr>
+        <w:t>Description for respondents: These are platform functions that may help staff create, review, communicate, and manage scholarship programs.</w:t>
+      </w:r>
+    </w:p>
+    <w:p>
+      <w:pPr>
         <w:spacing w:after="60"/>
         <w:ind w:left="317"/>
         <w:keepNext/>
@@ -2851,7 +3118,7 @@
         <w:ind w:left="504"/>
       </w:pPr>
       <w:r>
-        <w:t>[ ] View reports and audit history</w:t>
+        <w:t>[ ] View reports and audit history (a record of important actions and changes)</w:t>
       </w:r>
     </w:p>
     <w:p>
@@ -2860,7 +3127,7 @@
         <w:ind w:left="504"/>
       </w:pPr>
       <w:r>
-        <w:t>[ ] Manage provider team permissions</w:t>
+        <w:t>[ ] Manage provider team permissions (control what each staff account may view or change)</w:t>
       </w:r>
     </w:p>
     <w:p>
@@ -2886,6 +3153,18 @@
     </w:p>
     <w:p>
       <w:pPr>
+        <w:spacing w:after="40"/>
+      </w:pPr>
+      <w:r>
+        <w:rPr>
+          <w:i/>
+          <w:color w:val="555555"/>
+        </w:rPr>
+        <w:t>Description for respondents: Choose what information should be most visible first when a staff member opens an applicant record.</w:t>
+      </w:r>
+    </w:p>
+    <w:p>
+      <w:pPr>
         <w:spacing w:after="60"/>
         <w:ind w:left="317"/>
         <w:keepNext/>
@@ -3003,7 +3282,19 @@
         <w:rPr>
           <w:b/>
         </w:rPr>
-        <w:t>32. How likely would your organization be to participate in a limited pilot implementation?</w:t>
+        <w:t>32. How likely would your organization be to participate in a limited pilot implementation (a small, supervised trial before wider use)?</w:t>
+      </w:r>
+    </w:p>
+    <w:p>
+      <w:pPr>
+        <w:spacing w:after="40"/>
+      </w:pPr>
+      <w:r>
+        <w:rPr>
+          <w:i/>
+          <w:color w:val="555555"/>
+        </w:rPr>
+        <w:t>Description for respondents: A limited pilot is a small, supervised trial before wider use.</w:t>
       </w:r>
     </w:p>
     <w:p>
@@ -3051,6 +3342,18 @@
     </w:p>
     <w:p>
       <w:pPr>
+        <w:spacing w:after="40"/>
+      </w:pPr>
+      <w:r>
+        <w:rPr>
+          <w:i/>
+          <w:color w:val="555555"/>
+        </w:rPr>
+        <w:t>Description for respondents: Choose concerns that could make your organization hesitate to use the platform.</w:t>
+      </w:r>
+    </w:p>
+    <w:p>
+      <w:pPr>
         <w:spacing w:after="60"/>
         <w:ind w:left="317"/>
         <w:keepNext/>
@@ -3086,7 +3389,7 @@
         <w:ind w:left="504"/>
       </w:pPr>
       <w:r>
-        <w:t>[ ] Legal or policy compliance</w:t>
+        <w:t>[ ] Legal or policy compliance (following applicable laws, rules, and organization policies)</w:t>
       </w:r>
     </w:p>
     <w:p>
@@ -3193,6 +3496,18 @@
     </w:p>
     <w:p>
       <w:pPr>
+        <w:spacing w:after="40"/>
+      </w:pPr>
+      <w:r>
+        <w:rPr>
+          <w:i/>
+          <w:color w:val="555555"/>
+        </w:rPr>
+        <w:t>Description for respondents: Safeguards are controls that help protect applicant information and keep decisions accountable.</w:t>
+      </w:r>
+    </w:p>
+    <w:p>
+      <w:pPr>
         <w:spacing w:after="60"/>
         <w:ind w:left="317"/>
         <w:keepNext/>
@@ -3219,7 +3534,7 @@
         <w:ind w:left="504"/>
       </w:pPr>
       <w:r>
-        <w:t>[ ] Role-based permissions</w:t>
+        <w:t>[ ] Role-based permissions (access based on a staff member's assigned duties)</w:t>
       </w:r>
     </w:p>
     <w:p>
@@ -3255,7 +3570,7 @@
         <w:ind w:left="504"/>
       </w:pPr>
       <w:r>
-        <w:t>[ ] Activity and decision logs</w:t>
+        <w:t>[ ] Activity and decision logs (records of important actions, changes, and decisions)</w:t>
       </w:r>
     </w:p>
     <w:p>
@@ -3282,7 +3597,7 @@
         <w:ind w:left="504"/>
       </w:pPr>
       <w:r>
-        <w:t>[ ] Defined retention periods</w:t>
+        <w:t>[ ] Defined retention periods (clear rules for how long information is kept before deletion)</w:t>
       </w:r>
     </w:p>
     <w:p>
@@ -3300,7 +3615,7 @@
         <w:ind w:left="504"/>
       </w:pPr>
       <w:r>
-        <w:t>[ ] Independent security review</w:t>
+        <w:t>[ ] Independent security review (a security check performed by a qualified person outside the development team)</w:t>
       </w:r>
     </w:p>
     <w:p>
@@ -3439,6 +3754,18 @@
     </w:p>
     <w:p>
       <w:pPr>
+        <w:spacing w:after="40"/>
+      </w:pPr>
+      <w:r>
+        <w:rPr>
+          <w:i/>
+          <w:color w:val="555555"/>
+        </w:rPr>
+        <w:t>Description for respondents: Optional services are support activities beyond basic program posting and applicant prescreening.</w:t>
+      </w:r>
+    </w:p>
+    <w:p>
+      <w:pPr>
         <w:spacing w:after="60"/>
         <w:ind w:left="317"/>
         <w:keepNext/>
@@ -3474,7 +3801,7 @@
         <w:ind w:left="504"/>
       </w:pPr>
       <w:r>
-        <w:t>[ ] Document digitization assistance</w:t>
+        <w:t>[ ] Document digitization assistance (help converting paper records into usable digital files)</w:t>
       </w:r>
     </w:p>
     <w:p>
@@ -3501,7 +3828,7 @@
         <w:ind w:left="504"/>
       </w:pPr>
       <w:r>
-        <w:t>[ ] Data migration</w:t>
+        <w:t>[ ] Data migration (help moving existing records into the platform)</w:t>
       </w:r>
     </w:p>
     <w:p>
@@ -3554,6 +3881,18 @@
     </w:p>
     <w:p>
       <w:pPr>
+        <w:spacing w:after="40"/>
+      </w:pPr>
+      <w:r>
+        <w:rPr>
+          <w:i/>
+          <w:color w:val="555555"/>
+        </w:rPr>
+        <w:t>Description for respondents: Select the reasons an institution might support the platform through funding, partnership, or resources.</w:t>
+      </w:r>
+    </w:p>
+    <w:p>
+      <w:pPr>
         <w:spacing w:after="60"/>
         <w:ind w:left="317"/>
         <w:keepNext/>
@@ -3625,7 +3964,7 @@
         <w:ind w:left="504"/>
       </w:pPr>
       <w:r>
-        <w:t>[ ] Corporate social responsibility</w:t>
+        <w:t>[ ] Corporate social responsibility (a company's commitment to support communities or social causes)</w:t>
       </w:r>
     </w:p>
     <w:p>
@@ -3660,6 +3999,18 @@
     </w:p>
     <w:p>
       <w:pPr>
+        <w:spacing w:after="40"/>
+      </w:pPr>
+      <w:r>
+        <w:rPr>
+          <w:i/>
+          <w:color w:val="555555"/>
+        </w:rPr>
+        <w:t>Description for respondents: Choose the organization type that could realistically operate and maintain the platform after the capstone.</w:t>
+      </w:r>
+    </w:p>
+    <w:p>
+      <w:pPr>
         <w:spacing w:after="60"/>
         <w:ind w:left="317"/>
         <w:keepNext/>
@@ -3704,7 +4055,7 @@
         <w:ind w:left="504"/>
       </w:pPr>
       <w:r>
-        <w:t>[ ] Consortium of schools and providers</w:t>
+        <w:t>[ ] Consortium of schools and providers (a group of organizations that jointly operate or oversee the platform)</w:t>
       </w:r>
     </w:p>
     <w:p>

</xml_diff>